<commit_message>
docs(Paper/): add the modified version of Our-Research-Paper/New-version file
</commit_message>
<xml_diff>
--- a/Paper/Our-Research-Paper/New-version/0822220105101024, 0822220105101020, 0822220105101042, 0822220105101004_Ethics of Collecting User Data in Modern Web Applications.docx
+++ b/Paper/Our-Research-Paper/New-version/0822220105101024, 0822220105101020, 0822220105101042, 0822220105101004_Ethics of Collecting User Data in Modern Web Applications.docx
@@ -32,353 +32,581 @@
     </w:p>
     <w:p>
       <w:pPr>
-        <w:widowControl w:val="0"/>
-        <w:spacing w:after="0" w:line="347.36108779907227" w:lineRule="auto"/>
-        <w:ind w:left="1881.44287109375" w:right="1792.7880859375" w:firstLine="0"/>
+        <w:keepLines w:val="1"/>
+        <w:spacing w:after="140" w:lineRule="auto"/>
+        <w:jc w:val="center"/>
+        <w:rPr>
+          <w:rFonts w:ascii="Times New Roman" w:cs="Times New Roman" w:eastAsia="Times New Roman" w:hAnsi="Times New Roman"/>
+          <w:sz w:val="18"/>
+          <w:szCs w:val="18"/>
+        </w:rPr>
+      </w:pPr>
+      <w:r>
+        <w:rPr>
+          <w:rtl w:val="0"/>
+        </w:rPr>
+      </w:r>
+    </w:p>
+    <w:sdt>
+      <w:sdtPr>
+        <w:lock w:val="contentLocked"/>
+        <w:id w:val="640337056"/>
+        <w:tag w:val="goog_rdk_0"/>
+      </w:sdtPr>
+      <w:sdtContent>
+        <w:tbl>
+          <w:tblPr>
+            <w:tblStyle w:val="Table1"/>
+            <w:tblW w:w="10408.0" w:type="dxa"/>
+            <w:jc w:val="center"/>
+            <w:tblBorders>
+              <w:top w:color="000000" w:space="0" w:sz="0" w:val="nil"/>
+              <w:left w:color="000000" w:space="0" w:sz="0" w:val="nil"/>
+              <w:bottom w:color="000000" w:space="0" w:sz="0" w:val="nil"/>
+              <w:right w:color="000000" w:space="0" w:sz="0" w:val="nil"/>
+              <w:insideH w:color="000000" w:space="0" w:sz="0" w:val="nil"/>
+              <w:insideV w:color="000000" w:space="0" w:sz="0" w:val="nil"/>
+            </w:tblBorders>
+            <w:tblLayout w:type="fixed"/>
+            <w:tblLook w:val="0400"/>
+          </w:tblPr>
+          <w:tblGrid>
+            <w:gridCol w:w="2602"/>
+            <w:gridCol w:w="2602"/>
+            <w:gridCol w:w="2602"/>
+            <w:gridCol w:w="2602"/>
+            <w:tblGridChange w:id="0">
+              <w:tblGrid>
+                <w:gridCol w:w="2602"/>
+                <w:gridCol w:w="2602"/>
+                <w:gridCol w:w="2602"/>
+                <w:gridCol w:w="2602"/>
+              </w:tblGrid>
+            </w:tblGridChange>
+          </w:tblGrid>
+          <w:tr>
+            <w:trPr>
+              <w:cantSplit w:val="0"/>
+              <w:tblHeader w:val="0"/>
+            </w:trPr>
+            <w:tc>
+              <w:tcPr>
+                <w:tcMar>
+                  <w:top w:w="0.0" w:type="dxa"/>
+                  <w:bottom w:w="0.0" w:type="dxa"/>
+                </w:tcMar>
+                <w:vAlign w:val="top"/>
+              </w:tcPr>
+              <w:p>
+                <w:pPr>
+                  <w:spacing w:after="0" w:lineRule="auto"/>
+                  <w:jc w:val="center"/>
+                  <w:rPr>
+                    <w:rFonts w:ascii="Times New Roman" w:cs="Times New Roman" w:eastAsia="Times New Roman" w:hAnsi="Times New Roman"/>
+                    <w:sz w:val="18"/>
+                    <w:szCs w:val="18"/>
+                  </w:rPr>
+                </w:pPr>
+                <w:r>
+                  <w:rPr>
+                    <w:rFonts w:ascii="Times New Roman" w:cs="Times New Roman" w:eastAsia="Times New Roman" w:hAnsi="Times New Roman"/>
+                    <w:sz w:val="17"/>
+                    <w:szCs w:val="17"/>
+                    <w:rtl w:val="0"/>
+                  </w:rPr>
+                  <w:t xml:space="preserve">Md. Rakibul Hassan</w:t>
+                  <w:br w:type="textWrapping"/>
+                </w:r>
+                <w:r>
+                  <w:rPr>
+                    <w:rFonts w:ascii="Times New Roman" w:cs="Times New Roman" w:eastAsia="Times New Roman" w:hAnsi="Times New Roman"/>
+                    <w:i w:val="1"/>
+                    <w:iCs w:val="1"/>
+                    <w:sz w:val="17"/>
+                    <w:szCs w:val="17"/>
+                    <w:rtl w:val="0"/>
+                  </w:rPr>
+                  <w:t xml:space="preserve">Department of Computer Science</w:t>
+                  <w:br w:type="textWrapping"/>
+                  <w:t xml:space="preserve">&amp; Engineering</w:t>
+                  <w:br w:type="textWrapping"/>
+                  <w:t xml:space="preserve">Bangladesh Army International</w:t>
+                  <w:br w:type="textWrapping"/>
+                  <w:t xml:space="preserve">University of Science &amp;</w:t>
+                  <w:br w:type="textWrapping"/>
+                  <w:t xml:space="preserve">Technology (BAIUST)</w:t>
+                  <w:br w:type="textWrapping"/>
+                </w:r>
+                <w:r>
+                  <w:rPr>
+                    <w:rFonts w:ascii="Times New Roman" w:cs="Times New Roman" w:eastAsia="Times New Roman" w:hAnsi="Times New Roman"/>
+                    <w:sz w:val="17"/>
+                    <w:szCs w:val="17"/>
+                    <w:rtl w:val="0"/>
+                  </w:rPr>
+                  <w:t xml:space="preserve">Cumilla-3500, Bangladesh</w:t>
+                  <w:br w:type="textWrapping"/>
+                </w:r>
+                <w:r>
+                  <w:rPr>
+                    <w:rFonts w:ascii="Times New Roman" w:cs="Times New Roman" w:eastAsia="Times New Roman" w:hAnsi="Times New Roman"/>
+                    <w:sz w:val="13"/>
+                    <w:szCs w:val="13"/>
+                    <w:rtl w:val="0"/>
+                  </w:rPr>
+                  <w:t xml:space="preserve">rakibulhassanmiyaji27@gmail.com</w:t>
+                </w:r>
+                <w:r>
+                  <w:rPr>
+                    <w:rtl w:val="0"/>
+                  </w:rPr>
+                </w:r>
+              </w:p>
+            </w:tc>
+            <w:tc>
+              <w:tcPr>
+                <w:tcMar>
+                  <w:top w:w="0.0" w:type="dxa"/>
+                  <w:bottom w:w="0.0" w:type="dxa"/>
+                </w:tcMar>
+                <w:vAlign w:val="top"/>
+              </w:tcPr>
+              <w:p>
+                <w:pPr>
+                  <w:spacing w:after="0" w:lineRule="auto"/>
+                  <w:jc w:val="center"/>
+                  <w:rPr>
+                    <w:rFonts w:ascii="Times New Roman" w:cs="Times New Roman" w:eastAsia="Times New Roman" w:hAnsi="Times New Roman"/>
+                    <w:sz w:val="18"/>
+                    <w:szCs w:val="18"/>
+                  </w:rPr>
+                </w:pPr>
+                <w:r>
+                  <w:rPr>
+                    <w:rFonts w:ascii="Times New Roman" w:cs="Times New Roman" w:eastAsia="Times New Roman" w:hAnsi="Times New Roman"/>
+                    <w:sz w:val="17"/>
+                    <w:szCs w:val="17"/>
+                    <w:rtl w:val="0"/>
+                  </w:rPr>
+                  <w:t xml:space="preserve">Md. Tahsin Azad Shaikat</w:t>
+                  <w:br w:type="textWrapping"/>
+                </w:r>
+                <w:r>
+                  <w:rPr>
+                    <w:rFonts w:ascii="Times New Roman" w:cs="Times New Roman" w:eastAsia="Times New Roman" w:hAnsi="Times New Roman"/>
+                    <w:i w:val="1"/>
+                    <w:iCs w:val="1"/>
+                    <w:sz w:val="17"/>
+                    <w:szCs w:val="17"/>
+                    <w:rtl w:val="0"/>
+                  </w:rPr>
+                  <w:t xml:space="preserve">Department of Computer Science</w:t>
+                  <w:br w:type="textWrapping"/>
+                  <w:t xml:space="preserve">&amp; Engineering</w:t>
+                  <w:br w:type="textWrapping"/>
+                  <w:t xml:space="preserve">Bangladesh Army International</w:t>
+                  <w:br w:type="textWrapping"/>
+                  <w:t xml:space="preserve">University of Science &amp;</w:t>
+                  <w:br w:type="textWrapping"/>
+                  <w:t xml:space="preserve">Technology (BAIUST)</w:t>
+                  <w:br w:type="textWrapping"/>
+                </w:r>
+                <w:r>
+                  <w:rPr>
+                    <w:rFonts w:ascii="Times New Roman" w:cs="Times New Roman" w:eastAsia="Times New Roman" w:hAnsi="Times New Roman"/>
+                    <w:sz w:val="17"/>
+                    <w:szCs w:val="17"/>
+                    <w:rtl w:val="0"/>
+                  </w:rPr>
+                  <w:t xml:space="preserve">Cumilla-3500, Bangladesh</w:t>
+                  <w:br w:type="textWrapping"/>
+                </w:r>
+                <w:r>
+                  <w:rPr>
+                    <w:rFonts w:ascii="Times New Roman" w:cs="Times New Roman" w:eastAsia="Times New Roman" w:hAnsi="Times New Roman"/>
+                    <w:sz w:val="14"/>
+                    <w:szCs w:val="14"/>
+                    <w:rtl w:val="0"/>
+                  </w:rPr>
+                  <w:t xml:space="preserve">tahsin.azad.skt@gmail.com</w:t>
+                </w:r>
+                <w:r>
+                  <w:rPr>
+                    <w:rtl w:val="0"/>
+                  </w:rPr>
+                </w:r>
+              </w:p>
+            </w:tc>
+            <w:tc>
+              <w:tcPr>
+                <w:tcMar>
+                  <w:top w:w="0.0" w:type="dxa"/>
+                  <w:bottom w:w="0.0" w:type="dxa"/>
+                </w:tcMar>
+                <w:vAlign w:val="top"/>
+              </w:tcPr>
+              <w:p>
+                <w:pPr>
+                  <w:spacing w:after="0" w:lineRule="auto"/>
+                  <w:jc w:val="center"/>
+                  <w:rPr>
+                    <w:rFonts w:ascii="Times New Roman" w:cs="Times New Roman" w:eastAsia="Times New Roman" w:hAnsi="Times New Roman"/>
+                    <w:sz w:val="18"/>
+                    <w:szCs w:val="18"/>
+                  </w:rPr>
+                </w:pPr>
+                <w:r>
+                  <w:rPr>
+                    <w:rFonts w:ascii="Times New Roman" w:cs="Times New Roman" w:eastAsia="Times New Roman" w:hAnsi="Times New Roman"/>
+                    <w:sz w:val="17"/>
+                    <w:szCs w:val="17"/>
+                    <w:rtl w:val="0"/>
+                  </w:rPr>
+                  <w:t xml:space="preserve">Mohammad Sakibul Hasan</w:t>
+                  <w:br w:type="textWrapping"/>
+                </w:r>
+                <w:r>
+                  <w:rPr>
+                    <w:rFonts w:ascii="Times New Roman" w:cs="Times New Roman" w:eastAsia="Times New Roman" w:hAnsi="Times New Roman"/>
+                    <w:i w:val="1"/>
+                    <w:iCs w:val="1"/>
+                    <w:sz w:val="17"/>
+                    <w:szCs w:val="17"/>
+                    <w:rtl w:val="0"/>
+                  </w:rPr>
+                  <w:t xml:space="preserve">Department of Computer Science</w:t>
+                  <w:br w:type="textWrapping"/>
+                  <w:t xml:space="preserve">&amp; Engineering</w:t>
+                  <w:br w:type="textWrapping"/>
+                  <w:t xml:space="preserve">Bangladesh Army International</w:t>
+                  <w:br w:type="textWrapping"/>
+                  <w:t xml:space="preserve">University of Science &amp;</w:t>
+                  <w:br w:type="textWrapping"/>
+                  <w:t xml:space="preserve">Technology (BAIUST)</w:t>
+                  <w:br w:type="textWrapping"/>
+                </w:r>
+                <w:r>
+                  <w:rPr>
+                    <w:rFonts w:ascii="Times New Roman" w:cs="Times New Roman" w:eastAsia="Times New Roman" w:hAnsi="Times New Roman"/>
+                    <w:sz w:val="17"/>
+                    <w:szCs w:val="17"/>
+                    <w:rtl w:val="0"/>
+                  </w:rPr>
+                  <w:t xml:space="preserve">Chittagong-4100, Bangladesh</w:t>
+                  <w:br w:type="textWrapping"/>
+                </w:r>
+                <w:r>
+                  <w:rPr>
+                    <w:rFonts w:ascii="Times New Roman" w:cs="Times New Roman" w:eastAsia="Times New Roman" w:hAnsi="Times New Roman"/>
+                    <w:sz w:val="13"/>
+                    <w:szCs w:val="13"/>
+                    <w:rtl w:val="0"/>
+                  </w:rPr>
+                  <w:t xml:space="preserve">mohammadsakibbinnur@gmail.com</w:t>
+                </w:r>
+                <w:r>
+                  <w:rPr>
+                    <w:rtl w:val="0"/>
+                  </w:rPr>
+                </w:r>
+              </w:p>
+            </w:tc>
+            <w:tc>
+              <w:tcPr>
+                <w:tcMar>
+                  <w:top w:w="0.0" w:type="dxa"/>
+                  <w:bottom w:w="0.0" w:type="dxa"/>
+                </w:tcMar>
+                <w:vAlign w:val="top"/>
+              </w:tcPr>
+              <w:p>
+                <w:pPr>
+                  <w:spacing w:after="0" w:lineRule="auto"/>
+                  <w:jc w:val="center"/>
+                  <w:rPr>
+                    <w:rFonts w:ascii="Times New Roman" w:cs="Times New Roman" w:eastAsia="Times New Roman" w:hAnsi="Times New Roman"/>
+                    <w:sz w:val="18"/>
+                    <w:szCs w:val="18"/>
+                  </w:rPr>
+                </w:pPr>
+                <w:r>
+                  <w:rPr>
+                    <w:rFonts w:ascii="Times New Roman" w:cs="Times New Roman" w:eastAsia="Times New Roman" w:hAnsi="Times New Roman"/>
+                    <w:sz w:val="17"/>
+                    <w:szCs w:val="17"/>
+                    <w:rtl w:val="0"/>
+                  </w:rPr>
+                  <w:t xml:space="preserve">Muttakin Ahmed</w:t>
+                  <w:br w:type="textWrapping"/>
+                </w:r>
+                <w:r>
+                  <w:rPr>
+                    <w:rFonts w:ascii="Times New Roman" w:cs="Times New Roman" w:eastAsia="Times New Roman" w:hAnsi="Times New Roman"/>
+                    <w:i w:val="1"/>
+                    <w:iCs w:val="1"/>
+                    <w:sz w:val="17"/>
+                    <w:szCs w:val="17"/>
+                    <w:rtl w:val="0"/>
+                  </w:rPr>
+                  <w:t xml:space="preserve">Department of Computer Science</w:t>
+                  <w:br w:type="textWrapping"/>
+                  <w:t xml:space="preserve">&amp; Engineering</w:t>
+                  <w:br w:type="textWrapping"/>
+                  <w:t xml:space="preserve">Bangladesh Army International</w:t>
+                  <w:br w:type="textWrapping"/>
+                  <w:t xml:space="preserve">University of Science &amp;</w:t>
+                  <w:br w:type="textWrapping"/>
+                  <w:t xml:space="preserve">Technology (BAIUST)</w:t>
+                  <w:br w:type="textWrapping"/>
+                </w:r>
+                <w:r>
+                  <w:rPr>
+                    <w:rFonts w:ascii="Times New Roman" w:cs="Times New Roman" w:eastAsia="Times New Roman" w:hAnsi="Times New Roman"/>
+                    <w:sz w:val="17"/>
+                    <w:szCs w:val="17"/>
+                    <w:rtl w:val="0"/>
+                  </w:rPr>
+                  <w:t xml:space="preserve">Cumilla-3500, Bangladesh</w:t>
+                  <w:br w:type="textWrapping"/>
+                </w:r>
+                <w:r>
+                  <w:rPr>
+                    <w:rFonts w:ascii="Times New Roman" w:cs="Times New Roman" w:eastAsia="Times New Roman" w:hAnsi="Times New Roman"/>
+                    <w:sz w:val="14"/>
+                    <w:szCs w:val="14"/>
+                    <w:rtl w:val="0"/>
+                  </w:rPr>
+                  <w:t xml:space="preserve">muttakinahmedsiam@gmail.com</w:t>
+                </w:r>
+                <w:r>
+                  <w:rPr>
+                    <w:rtl w:val="0"/>
+                  </w:rPr>
+                </w:r>
+              </w:p>
+            </w:tc>
+          </w:tr>
+        </w:tbl>
+      </w:sdtContent>
+    </w:sdt>
+    <w:p>
+      <w:pPr>
+        <w:keepLines w:val="1"/>
+        <w:spacing w:after="0" w:line="120" w:lineRule="auto"/>
+        <w:rPr>
+          <w:rFonts w:ascii="Times New Roman" w:cs="Times New Roman" w:eastAsia="Times New Roman" w:hAnsi="Times New Roman"/>
+          <w:sz w:val="18"/>
+          <w:szCs w:val="18"/>
+        </w:rPr>
+      </w:pPr>
+      <w:r>
+        <w:rPr>
+          <w:rtl w:val="0"/>
+        </w:rPr>
+      </w:r>
+    </w:p>
+    <w:sdt>
+      <w:sdtPr>
+        <w:lock w:val="contentLocked"/>
+        <w:id w:val="-1058679370"/>
+        <w:tag w:val="goog_rdk_1"/>
+      </w:sdtPr>
+      <w:sdtContent>
+        <w:tbl>
+          <w:tblPr>
+            <w:tblStyle w:val="Table2"/>
+            <w:tblW w:w="10406.999999999998" w:type="dxa"/>
+            <w:jc w:val="center"/>
+            <w:tblBorders>
+              <w:top w:color="000000" w:space="0" w:sz="0" w:val="nil"/>
+              <w:left w:color="000000" w:space="0" w:sz="0" w:val="nil"/>
+              <w:bottom w:color="000000" w:space="0" w:sz="0" w:val="nil"/>
+              <w:right w:color="000000" w:space="0" w:sz="0" w:val="nil"/>
+              <w:insideH w:color="000000" w:space="0" w:sz="0" w:val="nil"/>
+              <w:insideV w:color="000000" w:space="0" w:sz="0" w:val="nil"/>
+            </w:tblBorders>
+            <w:tblLayout w:type="fixed"/>
+            <w:tblLook w:val="0400"/>
+          </w:tblPr>
+          <w:tblGrid>
+            <w:gridCol w:w="3469"/>
+            <w:gridCol w:w="3469"/>
+            <w:gridCol w:w="3469"/>
+            <w:tblGridChange w:id="0">
+              <w:tblGrid>
+                <w:gridCol w:w="3469"/>
+                <w:gridCol w:w="3469"/>
+                <w:gridCol w:w="3469"/>
+              </w:tblGrid>
+            </w:tblGridChange>
+          </w:tblGrid>
+          <w:tr>
+            <w:trPr>
+              <w:cantSplit w:val="0"/>
+              <w:trHeight w:val="1732.8515625" w:hRule="atLeast"/>
+              <w:tblHeader w:val="0"/>
+            </w:trPr>
+            <w:tc>
+              <w:tcPr>
+                <w:tcMar>
+                  <w:top w:w="0.0" w:type="dxa"/>
+                  <w:bottom w:w="0.0" w:type="dxa"/>
+                </w:tcMar>
+              </w:tcPr>
+              <w:p>
+                <w:pPr>
+                  <w:spacing w:line="276" w:lineRule="auto"/>
+                  <w:rPr>
+                    <w:rFonts w:ascii="Times New Roman" w:cs="Times New Roman" w:eastAsia="Times New Roman" w:hAnsi="Times New Roman"/>
+                    <w:sz w:val="18"/>
+                    <w:szCs w:val="18"/>
+                  </w:rPr>
+                </w:pPr>
+                <w:r>
+                  <w:rPr>
+                    <w:rtl w:val="0"/>
+                  </w:rPr>
+                </w:r>
+              </w:p>
+            </w:tc>
+            <w:tc>
+              <w:tcPr>
+                <w:tcMar>
+                  <w:top w:w="0.0" w:type="dxa"/>
+                  <w:bottom w:w="0.0" w:type="dxa"/>
+                </w:tcMar>
+                <w:vAlign w:val="top"/>
+              </w:tcPr>
+              <w:p>
+                <w:pPr>
+                  <w:spacing w:after="0" w:lineRule="auto"/>
+                  <w:jc w:val="center"/>
+                  <w:rPr>
+                    <w:rFonts w:ascii="Times New Roman" w:cs="Times New Roman" w:eastAsia="Times New Roman" w:hAnsi="Times New Roman"/>
+                    <w:sz w:val="16"/>
+                    <w:szCs w:val="16"/>
+                  </w:rPr>
+                </w:pPr>
+                <w:r>
+                  <w:rPr>
+                    <w:rFonts w:ascii="Times New Roman" w:cs="Times New Roman" w:eastAsia="Times New Roman" w:hAnsi="Times New Roman"/>
+                    <w:sz w:val="17"/>
+                    <w:szCs w:val="17"/>
+                    <w:rtl w:val="0"/>
+                  </w:rPr>
+                  <w:t xml:space="preserve">Md. Fahim Kabir Chowdhury</w:t>
+                </w:r>
+                <w:r>
+                  <w:rPr>
+                    <w:rFonts w:ascii="Times New Roman" w:cs="Times New Roman" w:eastAsia="Times New Roman" w:hAnsi="Times New Roman"/>
+                    <w:sz w:val="17"/>
+                    <w:szCs w:val="17"/>
+                    <w:vertAlign w:val="superscript"/>
+                    <w:rtl w:val="0"/>
+                  </w:rPr>
+                  <w:t xml:space="preserve">*</w:t>
+                </w:r>
+                <w:r>
+                  <w:rPr>
+                    <w:rFonts w:ascii="Times New Roman" w:cs="Times New Roman" w:eastAsia="Times New Roman" w:hAnsi="Times New Roman"/>
+                    <w:sz w:val="17"/>
+                    <w:szCs w:val="17"/>
+                    <w:rtl w:val="0"/>
+                  </w:rPr>
+                  <w:br w:type="textWrapping"/>
+                </w:r>
+                <w:r>
+                  <w:rPr>
+                    <w:rFonts w:ascii="Times New Roman" w:cs="Times New Roman" w:eastAsia="Times New Roman" w:hAnsi="Times New Roman"/>
+                    <w:i w:val="1"/>
+                    <w:iCs w:val="1"/>
+                    <w:sz w:val="17"/>
+                    <w:szCs w:val="17"/>
+                    <w:rtl w:val="0"/>
+                  </w:rPr>
+                  <w:t xml:space="preserve">Lecturer</w:t>
+                  <w:br w:type="textWrapping"/>
+                  <w:t xml:space="preserve">Department of Computer Science</w:t>
+                  <w:br w:type="textWrapping"/>
+                  <w:t xml:space="preserve">&amp; Engineering</w:t>
+                  <w:br w:type="textWrapping"/>
+                  <w:t xml:space="preserve">Bangladesh Army International</w:t>
+                  <w:br w:type="textWrapping"/>
+                  <w:t xml:space="preserve">University of Science &amp;</w:t>
+                  <w:br w:type="textWrapping"/>
+                  <w:t xml:space="preserve">Technology (BAIUST)</w:t>
+                  <w:br w:type="textWrapping"/>
+                </w:r>
+                <w:r>
+                  <w:rPr>
+                    <w:rFonts w:ascii="Times New Roman" w:cs="Times New Roman" w:eastAsia="Times New Roman" w:hAnsi="Times New Roman"/>
+                    <w:sz w:val="17"/>
+                    <w:szCs w:val="17"/>
+                    <w:rtl w:val="0"/>
+                  </w:rPr>
+                  <w:t xml:space="preserve">Chittagong-4202, Bangladesh</w:t>
+                  <w:br w:type="textWrapping"/>
+                </w:r>
+                <w:r>
+                  <w:rPr>
+                    <w:rFonts w:ascii="Times New Roman" w:cs="Times New Roman" w:eastAsia="Times New Roman" w:hAnsi="Times New Roman"/>
+                    <w:sz w:val="16"/>
+                    <w:szCs w:val="16"/>
+                    <w:rtl w:val="0"/>
+                  </w:rPr>
+                  <w:t xml:space="preserve">fahim.cse@baiust.ac.bd</w:t>
+                </w:r>
+              </w:p>
+            </w:tc>
+            <w:tc>
+              <w:tcPr>
+                <w:tcMar>
+                  <w:top w:w="0.0" w:type="dxa"/>
+                  <w:bottom w:w="0.0" w:type="dxa"/>
+                </w:tcMar>
+              </w:tcPr>
+              <w:p>
+                <w:pPr>
+                  <w:spacing w:line="276" w:lineRule="auto"/>
+                  <w:rPr>
+                    <w:rFonts w:ascii="Times New Roman" w:cs="Times New Roman" w:eastAsia="Times New Roman" w:hAnsi="Times New Roman"/>
+                    <w:sz w:val="18"/>
+                    <w:szCs w:val="18"/>
+                  </w:rPr>
+                </w:pPr>
+                <w:r>
+                  <w:rPr>
+                    <w:rtl w:val="0"/>
+                  </w:rPr>
+                </w:r>
+              </w:p>
+            </w:tc>
+          </w:tr>
+        </w:tbl>
+      </w:sdtContent>
+    </w:sdt>
+    <w:p>
+      <w:pPr>
+        <w:keepLines w:val="1"/>
+        <w:spacing w:after="0" w:before="40" w:lineRule="auto"/>
         <w:jc w:val="center"/>
         <w:rPr>
           <w:rFonts w:ascii="Times New Roman" w:cs="Times New Roman" w:eastAsia="Times New Roman" w:hAnsi="Times New Roman"/>
           <w:sz w:val="15.960000038146973"/>
           <w:szCs w:val="15.960000038146973"/>
         </w:rPr>
-        <w:sectPr>
-          <w:headerReference r:id="rId7" w:type="default"/>
-          <w:footerReference r:id="rId8" w:type="default"/>
-          <w:pgSz w:h="16838" w:w="11906" w:orient="portrait"/>
-          <w:pgMar w:bottom="1417" w:top="1077" w:left="737" w:right="737" w:header="283" w:footer="454"/>
-          <w:pgNumType w:start="1"/>
-        </w:sectPr>
-      </w:pPr>
-      <w:r>
-        <w:rPr>
-          <w:rtl w:val="0"/>
-        </w:rPr>
-      </w:r>
-    </w:p>
-    <w:p>
-      <w:pPr>
-        <w:widowControl w:val="0"/>
-        <w:spacing w:after="0" w:lineRule="auto"/>
-        <w:ind w:left="76.67991638183594" w:firstLine="0"/>
-        <w:jc w:val="center"/>
-        <w:rPr>
-          <w:rFonts w:ascii="Times New Roman" w:cs="Times New Roman" w:eastAsia="Times New Roman" w:hAnsi="Times New Roman"/>
-          <w:sz w:val="18"/>
-          <w:szCs w:val="18"/>
-        </w:rPr>
-      </w:pPr>
-      <w:r>
-        <w:rPr>
-          <w:rFonts w:ascii="Times New Roman" w:cs="Times New Roman" w:eastAsia="Times New Roman" w:hAnsi="Times New Roman"/>
-          <w:sz w:val="18"/>
-          <w:szCs w:val="18"/>
-          <w:rtl w:val="0"/>
-        </w:rPr>
-        <w:t xml:space="preserve">Md. Rakibul Hassan </w:t>
-        <w:br w:type="textWrapping"/>
-      </w:r>
+      </w:pPr>
       <w:r>
         <w:rPr>
           <w:rFonts w:ascii="Times New Roman" w:cs="Times New Roman" w:eastAsia="Times New Roman" w:hAnsi="Times New Roman"/>
           <w:i w:val="1"/>
           <w:iCs w:val="1"/>
-          <w:sz w:val="18"/>
-          <w:szCs w:val="18"/>
-          <w:rtl w:val="0"/>
-        </w:rPr>
-        <w:t xml:space="preserve">Department of Computer Science &amp; Engineering </w:t>
-        <w:br w:type="textWrapping"/>
-        <w:t xml:space="preserve">Bangladesh Army International University of Science &amp; Technology (BAIUST)</w:t>
-        <w:br w:type="textWrapping"/>
-      </w:r>
-      <w:r>
-        <w:rPr>
-          <w:rFonts w:ascii="Times New Roman" w:cs="Times New Roman" w:eastAsia="Times New Roman" w:hAnsi="Times New Roman"/>
-          <w:sz w:val="18"/>
-          <w:szCs w:val="18"/>
-          <w:rtl w:val="0"/>
-        </w:rPr>
-        <w:t xml:space="preserve">Cumilla-3500, Bangladesh</w:t>
-        <w:br w:type="textWrapping"/>
-        <w:t xml:space="preserve">rakibulhassanmiyaji27@gmail.com </w:t>
-      </w:r>
-    </w:p>
-    <w:p>
-      <w:pPr>
-        <w:widowControl w:val="0"/>
-        <w:spacing w:after="0" w:line="225.62411785125732" w:lineRule="auto"/>
-        <w:ind w:left="27.540283203125" w:right="133.5723876953125" w:firstLine="0"/>
-        <w:jc w:val="center"/>
-        <w:rPr>
-          <w:rFonts w:ascii="Times New Roman" w:cs="Times New Roman" w:eastAsia="Times New Roman" w:hAnsi="Times New Roman"/>
-          <w:sz w:val="18"/>
-          <w:szCs w:val="18"/>
-        </w:rPr>
-      </w:pPr>
-      <w:r>
-        <w:rPr>
-          <w:rtl w:val="0"/>
-        </w:rPr>
-      </w:r>
-    </w:p>
-    <w:p>
-      <w:pPr>
-        <w:widowControl w:val="0"/>
-        <w:spacing w:after="0" w:line="225.62411785125732" w:lineRule="auto"/>
-        <w:ind w:left="27.540283203125" w:right="133.5723876953125" w:firstLine="0"/>
-        <w:jc w:val="center"/>
-        <w:rPr>
-          <w:rFonts w:ascii="Times New Roman" w:cs="Times New Roman" w:eastAsia="Times New Roman" w:hAnsi="Times New Roman"/>
-          <w:sz w:val="18"/>
-          <w:szCs w:val="18"/>
-        </w:rPr>
-      </w:pPr>
-      <w:r>
-        <w:rPr>
-          <w:rtl w:val="0"/>
-        </w:rPr>
-      </w:r>
-    </w:p>
-    <w:p>
-      <w:pPr>
-        <w:widowControl w:val="0"/>
-        <w:spacing w:after="0" w:line="225.62411785125732" w:lineRule="auto"/>
-        <w:ind w:left="27.540283203125" w:right="133.5723876953125" w:firstLine="0"/>
-        <w:jc w:val="center"/>
-        <w:rPr>
-          <w:rFonts w:ascii="Times New Roman" w:cs="Times New Roman" w:eastAsia="Times New Roman" w:hAnsi="Times New Roman"/>
-          <w:sz w:val="18"/>
-          <w:szCs w:val="18"/>
-        </w:rPr>
-      </w:pPr>
-      <w:r>
-        <w:rPr>
-          <w:rFonts w:ascii="Times New Roman" w:cs="Times New Roman" w:eastAsia="Times New Roman" w:hAnsi="Times New Roman"/>
-          <w:sz w:val="18"/>
-          <w:szCs w:val="18"/>
-          <w:rtl w:val="0"/>
-        </w:rPr>
-        <w:t xml:space="preserve">Md. Tahsin Azad Shaikat </w:t>
-        <w:br w:type="textWrapping"/>
-      </w:r>
-      <w:r>
-        <w:rPr>
-          <w:rFonts w:ascii="Times New Roman" w:cs="Times New Roman" w:eastAsia="Times New Roman" w:hAnsi="Times New Roman"/>
-          <w:i w:val="1"/>
-          <w:iCs w:val="1"/>
-          <w:sz w:val="18"/>
-          <w:szCs w:val="18"/>
-          <w:rtl w:val="0"/>
-        </w:rPr>
-        <w:t xml:space="preserve">Department of Computer Science &amp; Engineering </w:t>
-        <w:br w:type="textWrapping"/>
-        <w:t xml:space="preserve">Bangladesh Army International University of Science &amp; Technology (BAIUST)</w:t>
-        <w:br w:type="textWrapping"/>
-      </w:r>
-      <w:r>
-        <w:rPr>
-          <w:rFonts w:ascii="Times New Roman" w:cs="Times New Roman" w:eastAsia="Times New Roman" w:hAnsi="Times New Roman"/>
-          <w:sz w:val="18"/>
-          <w:szCs w:val="18"/>
-          <w:rtl w:val="0"/>
-        </w:rPr>
-        <w:t xml:space="preserve">Cumilla-3500, Bangladesh</w:t>
-        <w:br w:type="textWrapping"/>
-        <w:t xml:space="preserve">tahsin.azad.skt@gmail.com </w:t>
-      </w:r>
-    </w:p>
-    <w:p>
-      <w:pPr>
-        <w:widowControl w:val="0"/>
-        <w:spacing w:after="0" w:lineRule="auto"/>
-        <w:ind w:left="104.16015625" w:firstLine="0"/>
-        <w:rPr>
-          <w:rFonts w:ascii="Times New Roman" w:cs="Times New Roman" w:eastAsia="Times New Roman" w:hAnsi="Times New Roman"/>
-          <w:sz w:val="18"/>
-          <w:szCs w:val="18"/>
-        </w:rPr>
-      </w:pPr>
-      <w:r>
-        <w:rPr>
-          <w:rtl w:val="0"/>
-        </w:rPr>
-      </w:r>
-    </w:p>
-    <w:p>
-      <w:pPr>
-        <w:widowControl w:val="0"/>
-        <w:spacing w:after="0" w:lineRule="auto"/>
-        <w:ind w:left="130.73974609375" w:firstLine="0"/>
-        <w:jc w:val="center"/>
-        <w:rPr>
-          <w:rFonts w:ascii="Times New Roman" w:cs="Times New Roman" w:eastAsia="Times New Roman" w:hAnsi="Times New Roman"/>
-          <w:sz w:val="18"/>
-          <w:szCs w:val="18"/>
-        </w:rPr>
-      </w:pPr>
-      <w:r>
-        <w:rPr>
-          <w:rtl w:val="0"/>
-        </w:rPr>
-      </w:r>
-    </w:p>
-    <w:p>
-      <w:pPr>
-        <w:widowControl w:val="0"/>
-        <w:spacing w:after="0" w:lineRule="auto"/>
-        <w:ind w:left="130.73974609375" w:firstLine="0"/>
-        <w:jc w:val="center"/>
-        <w:rPr>
-          <w:rFonts w:ascii="Times New Roman" w:cs="Times New Roman" w:eastAsia="Times New Roman" w:hAnsi="Times New Roman"/>
-          <w:sz w:val="18"/>
-          <w:szCs w:val="18"/>
-        </w:rPr>
-      </w:pPr>
-      <w:r>
-        <w:rPr>
-          <w:rFonts w:ascii="Times New Roman" w:cs="Times New Roman" w:eastAsia="Times New Roman" w:hAnsi="Times New Roman"/>
-          <w:sz w:val="18"/>
-          <w:szCs w:val="18"/>
-          <w:rtl w:val="0"/>
-        </w:rPr>
-        <w:t xml:space="preserve">Mohammad Sakibul Hasan</w:t>
-        <w:br w:type="textWrapping"/>
-      </w:r>
-      <w:r>
-        <w:rPr>
-          <w:rFonts w:ascii="Times New Roman" w:cs="Times New Roman" w:eastAsia="Times New Roman" w:hAnsi="Times New Roman"/>
-          <w:i w:val="1"/>
-          <w:iCs w:val="1"/>
-          <w:sz w:val="18"/>
-          <w:szCs w:val="18"/>
-          <w:rtl w:val="0"/>
-        </w:rPr>
-        <w:t xml:space="preserve">Department of Computer Science &amp; Engineering </w:t>
-        <w:br w:type="textWrapping"/>
-        <w:t xml:space="preserve">Bangladesh Army International University of Science &amp; Technology (BAIUST)</w:t>
-        <w:br w:type="textWrapping"/>
-      </w:r>
-      <w:r>
-        <w:rPr>
-          <w:rFonts w:ascii="Times New Roman" w:cs="Times New Roman" w:eastAsia="Times New Roman" w:hAnsi="Times New Roman"/>
-          <w:sz w:val="18"/>
-          <w:szCs w:val="18"/>
-          <w:rtl w:val="0"/>
-        </w:rPr>
-        <w:t xml:space="preserve">Chittagong-4100, Bangladesh</w:t>
-        <w:br w:type="textWrapping"/>
-        <w:t xml:space="preserve">mohammadsakibbinnur@gmail.com</w:t>
-      </w:r>
-    </w:p>
-    <w:p>
-      <w:pPr>
-        <w:widowControl w:val="0"/>
-        <w:spacing w:after="0" w:line="225.62411785125732" w:lineRule="auto"/>
-        <w:ind w:left="27.540283203125" w:right="133.5723876953125" w:firstLine="0"/>
-        <w:jc w:val="center"/>
-        <w:rPr>
-          <w:rFonts w:ascii="Times New Roman" w:cs="Times New Roman" w:eastAsia="Times New Roman" w:hAnsi="Times New Roman"/>
-          <w:sz w:val="18"/>
-          <w:szCs w:val="18"/>
-        </w:rPr>
-      </w:pPr>
-      <w:r>
-        <w:rPr>
-          <w:rtl w:val="0"/>
-        </w:rPr>
-      </w:r>
-    </w:p>
-    <w:p>
-      <w:pPr>
-        <w:widowControl w:val="0"/>
-        <w:spacing w:after="0" w:line="225.62411785125732" w:lineRule="auto"/>
-        <w:ind w:left="27.540283203125" w:right="133.5723876953125" w:firstLine="0"/>
-        <w:jc w:val="center"/>
-        <w:rPr>
-          <w:rFonts w:ascii="Times New Roman" w:cs="Times New Roman" w:eastAsia="Times New Roman" w:hAnsi="Times New Roman"/>
-          <w:sz w:val="18"/>
-          <w:szCs w:val="18"/>
-        </w:rPr>
-      </w:pPr>
-      <w:r>
-        <w:rPr>
-          <w:rFonts w:ascii="Times New Roman" w:cs="Times New Roman" w:eastAsia="Times New Roman" w:hAnsi="Times New Roman"/>
-          <w:sz w:val="18"/>
-          <w:szCs w:val="18"/>
-          <w:rtl w:val="0"/>
-        </w:rPr>
-        <w:t xml:space="preserve">Muttakin Ahmed</w:t>
-        <w:br w:type="textWrapping"/>
-      </w:r>
-      <w:r>
-        <w:rPr>
-          <w:rFonts w:ascii="Times New Roman" w:cs="Times New Roman" w:eastAsia="Times New Roman" w:hAnsi="Times New Roman"/>
-          <w:i w:val="1"/>
-          <w:iCs w:val="1"/>
-          <w:sz w:val="18"/>
-          <w:szCs w:val="18"/>
-          <w:rtl w:val="0"/>
-        </w:rPr>
-        <w:t xml:space="preserve">Department of Computer Science &amp; Engineering </w:t>
-        <w:br w:type="textWrapping"/>
-        <w:t xml:space="preserve">Bangladesh Army International University of Science &amp; Technology (BAIUST)</w:t>
-        <w:br w:type="textWrapping"/>
-      </w:r>
-      <w:r>
-        <w:rPr>
-          <w:rFonts w:ascii="Times New Roman" w:cs="Times New Roman" w:eastAsia="Times New Roman" w:hAnsi="Times New Roman"/>
-          <w:sz w:val="18"/>
-          <w:szCs w:val="18"/>
-          <w:rtl w:val="0"/>
-        </w:rPr>
-        <w:t xml:space="preserve">Cumilla-3500, Bangladesh</w:t>
-        <w:br w:type="textWrapping"/>
-        <w:t xml:space="preserve">muttakinahmedsiam@gmail.com </w:t>
-      </w:r>
-    </w:p>
-    <w:p>
-      <w:pPr>
-        <w:keepNext w:val="0"/>
-        <w:widowControl w:val="1"/>
-        <w:spacing w:after="0" w:before="0" w:line="240" w:lineRule="auto"/>
-        <w:ind w:firstLine="230"/>
-        <w:jc w:val="center"/>
-        <w:rPr>
-          <w:rFonts w:ascii="Times New Roman" w:cs="Times New Roman" w:eastAsia="Times New Roman" w:hAnsi="Times New Roman"/>
-          <w:sz w:val="22"/>
-          <w:szCs w:val="22"/>
-        </w:rPr>
-        <w:sectPr>
-          <w:type w:val="continuous"/>
-          <w:pgSz w:h="16838" w:w="11906" w:orient="portrait"/>
-          <w:pgMar w:bottom="1440" w:top="1440" w:left="904.2600250244141" w:right="855.372314453125" w:header="720" w:footer="720"/>
-          <w:cols w:equalWidth="0" w:num="4">
-            <w:col w:space="0" w:w="2640"/>
-            <w:col w:space="0" w:w="2640"/>
-            <w:col w:space="0" w:w="2640"/>
-            <w:col w:space="0" w:w="2640"/>
-          </w:cols>
-        </w:sectPr>
-      </w:pPr>
-      <w:r>
-        <w:rPr>
-          <w:rtl w:val="0"/>
-        </w:rPr>
-      </w:r>
-    </w:p>
-    <w:p>
-      <w:pPr>
-        <w:keepNext w:val="0"/>
-        <w:widowControl w:val="1"/>
-        <w:spacing w:after="0" w:before="0" w:line="240" w:lineRule="auto"/>
-        <w:ind w:firstLine="230"/>
-        <w:jc w:val="center"/>
-        <w:rPr>
-          <w:rFonts w:ascii="Times New Roman" w:cs="Times New Roman" w:eastAsia="Times New Roman" w:hAnsi="Times New Roman"/>
-          <w:sz w:val="22"/>
-          <w:szCs w:val="22"/>
-        </w:rPr>
-      </w:pPr>
+          <w:sz w:val="16"/>
+          <w:szCs w:val="16"/>
+          <w:rtl w:val="0"/>
+        </w:rPr>
+        <w:t xml:space="preserve">*Corresponding author</w:t>
+      </w:r>
       <w:r>
         <w:rPr>
           <w:rtl w:val="0"/>
@@ -410,9 +638,11 @@
           <w:szCs w:val="20"/>
         </w:rPr>
         <w:sectPr>
-          <w:type w:val="continuous"/>
+          <w:headerReference r:id="rId7" w:type="default"/>
+          <w:footerReference r:id="rId8" w:type="default"/>
           <w:pgSz w:h="16838" w:w="11906" w:orient="portrait"/>
           <w:pgMar w:bottom="1417" w:top="1077" w:left="737" w:right="737" w:header="283" w:footer="454"/>
+          <w:pgNumType w:start="1"/>
         </w:sectPr>
       </w:pPr>
       <w:r>
@@ -1221,6 +1451,44 @@
       </w:pPr>
       <w:r>
         <w:rPr>
+          <w:rtl w:val="0"/>
+        </w:rPr>
+      </w:r>
+    </w:p>
+    <w:p>
+      <w:pPr>
+        <w:spacing w:after="0" w:before="0" w:lineRule="auto"/>
+        <w:ind w:left="0" w:firstLine="288"/>
+        <w:jc w:val="left"/>
+        <w:rPr>
+          <w:rFonts w:ascii="Times New Roman" w:cs="Times New Roman" w:eastAsia="Times New Roman" w:hAnsi="Times New Roman"/>
+          <w:i w:val="1"/>
+          <w:iCs w:val="1"/>
+          <w:sz w:val="20"/>
+          <w:szCs w:val="20"/>
+        </w:rPr>
+      </w:pPr>
+      <w:r>
+        <w:rPr>
+          <w:rtl w:val="0"/>
+        </w:rPr>
+      </w:r>
+    </w:p>
+    <w:p>
+      <w:pPr>
+        <w:spacing w:after="0" w:before="0" w:lineRule="auto"/>
+        <w:ind w:left="0" w:firstLine="288"/>
+        <w:jc w:val="left"/>
+        <w:rPr>
+          <w:rFonts w:ascii="Times New Roman" w:cs="Times New Roman" w:eastAsia="Times New Roman" w:hAnsi="Times New Roman"/>
+          <w:i w:val="1"/>
+          <w:iCs w:val="1"/>
+          <w:sz w:val="20"/>
+          <w:szCs w:val="20"/>
+        </w:rPr>
+      </w:pPr>
+      <w:r>
+        <w:rPr>
           <w:rFonts w:ascii="Times New Roman" w:cs="Times New Roman" w:eastAsia="Times New Roman" w:hAnsi="Times New Roman"/>
           <w:i w:val="1"/>
           <w:iCs w:val="1"/>
@@ -1600,7 +1868,7 @@
           <w:szCs w:val="20"/>
           <w:rtl w:val="0"/>
         </w:rPr>
-        <w:t xml:space="preserve">  This section describes the design, implementation, and analytical approach used to investigate user perceptions of data collection ethics. It outlines the survey instrument, sampling method, and safeguards applied to protect respondent privacy throughout the study. The steps taken are described in sufficient detail to allow the study to be replicated or extended by future researchers. </w:t>
+        <w:t xml:space="preserve">  This section describes the design, implementation, and analytical approach used to investigate user perceptions of data collection ethics, situating the study's methodological choices within the broader context of privacy research. It outlines the survey instrument, sampling method, and safeguards applied to protect respondent privacy throughout the study, including the rationale behind key design decisions and how they align with established ethical research standards. The steps taken are described in sufficient detail to allow the study to be replicated or extended by future researchers, with particular attention paid to documenting procedural choices that may influence data quality, respondent trust, or the generalizability of findings.</w:t>
       </w:r>
     </w:p>
     <w:p>
@@ -1653,13 +1921,13 @@
     <w:sdt>
       <w:sdtPr>
         <w:lock w:val="contentLocked"/>
-        <w:id w:val="-1150356951"/>
-        <w:tag w:val="goog_rdk_0"/>
+        <w:id w:val="-657046517"/>
+        <w:tag w:val="goog_rdk_2"/>
       </w:sdtPr>
       <w:sdtContent>
         <w:tbl>
           <w:tblPr>
-            <w:tblStyle w:val="Table1"/>
+            <w:tblStyle w:val="Table3"/>
             <w:tblW w:w="5035.999999999999" w:type="dxa"/>
             <w:jc w:val="left"/>
             <w:tblBorders>
@@ -2582,7 +2850,7 @@
         </w:rPr>
         <w:drawing>
           <wp:inline distB="114300" distT="114300" distL="114300" distR="114300">
-            <wp:extent cx="3146743" cy="1400175"/>
+            <wp:extent cx="3076924" cy="1206817"/>
             <wp:effectExtent b="0" l="0" r="0" t="0"/>
             <wp:docPr id="1" name="image2.png"/>
             <a:graphic>
@@ -2602,7 +2870,7 @@
                   <pic:spPr>
                     <a:xfrm>
                       <a:off x="0" y="0"/>
-                      <a:ext cx="3146743" cy="1400175"/>
+                      <a:ext cx="3076924" cy="1206817"/>
                     </a:xfrm>
                     <a:prstGeom prst="rect"/>
                     <a:ln/>
@@ -2956,7 +3224,7 @@
     </w:p>
     <w:tbl>
       <w:tblPr>
-        <w:tblStyle w:val="Table2"/>
+        <w:tblStyle w:val="Table4"/>
         <w:tblW w:w="4649.0" w:type="dxa"/>
         <w:jc w:val="center"/>
         <w:tblBorders>
@@ -3213,7 +3481,7 @@
     </w:p>
     <w:tbl>
       <w:tblPr>
-        <w:tblStyle w:val="Table3"/>
+        <w:tblStyle w:val="Table5"/>
         <w:tblW w:w="4649.0" w:type="dxa"/>
         <w:jc w:val="center"/>
         <w:tblBorders>
@@ -3609,7 +3877,7 @@
     </w:p>
     <w:tbl>
       <w:tblPr>
-        <w:tblStyle w:val="Table4"/>
+        <w:tblStyle w:val="Table6"/>
         <w:tblW w:w="4649.0" w:type="dxa"/>
         <w:jc w:val="center"/>
         <w:tblBorders>
@@ -3726,7 +3994,7 @@
     </w:p>
     <w:tbl>
       <w:tblPr>
-        <w:tblStyle w:val="Table5"/>
+        <w:tblStyle w:val="Table7"/>
         <w:tblW w:w="4649.0" w:type="dxa"/>
         <w:jc w:val="center"/>
         <w:tblBorders>
@@ -3911,7 +4179,7 @@
     </w:p>
     <w:tbl>
       <w:tblPr>
-        <w:tblStyle w:val="Table6"/>
+        <w:tblStyle w:val="Table8"/>
         <w:tblW w:w="4649.0" w:type="dxa"/>
         <w:jc w:val="center"/>
         <w:tblBorders>
@@ -4371,111 +4639,6 @@
     </w:p>
     <w:p>
       <w:pPr>
-        <w:spacing w:after="0" w:before="0" w:lineRule="auto"/>
-        <w:jc w:val="center"/>
-        <w:rPr>
-          <w:rFonts w:ascii="Times New Roman" w:cs="Times New Roman" w:eastAsia="Times New Roman" w:hAnsi="Times New Roman"/>
-          <w:b w:val="1"/>
-          <w:bCs w:val="1"/>
-          <w:i w:val="1"/>
-          <w:iCs w:val="1"/>
-          <w:sz w:val="20"/>
-          <w:szCs w:val="20"/>
-        </w:rPr>
-      </w:pPr>
-      <w:r>
-        <w:rPr>
-          <w:rFonts w:ascii="Times New Roman" w:cs="Times New Roman" w:eastAsia="Times New Roman" w:hAnsi="Times New Roman"/>
-          <w:i w:val="1"/>
-          <w:iCs w:val="1"/>
-          <w:sz w:val="20"/>
-          <w:szCs w:val="20"/>
-          <w:rtl w:val="0"/>
-        </w:rPr>
-        <w:t xml:space="preserve">D. App Permissions and Protective Behavior</w:t>
-      </w:r>
-      <w:r>
-        <w:rPr>
-          <w:rtl w:val="0"/>
-        </w:rPr>
-      </w:r>
-    </w:p>
-    <w:p>
-      <w:pPr>
-        <w:spacing w:after="0" w:before="0" w:lineRule="auto"/>
-        <w:ind w:left="0" w:firstLine="288"/>
-        <w:jc w:val="both"/>
-        <w:rPr>
-          <w:rFonts w:ascii="Times New Roman" w:cs="Times New Roman" w:eastAsia="Times New Roman" w:hAnsi="Times New Roman"/>
-          <w:sz w:val="20"/>
-          <w:szCs w:val="20"/>
-        </w:rPr>
-      </w:pPr>
-      <w:r>
-        <w:rPr>
-          <w:rFonts w:ascii="Times New Roman" w:cs="Times New Roman" w:eastAsia="Times New Roman" w:hAnsi="Times New Roman"/>
-          <w:sz w:val="20"/>
-          <w:szCs w:val="20"/>
-          <w:rtl w:val="0"/>
-        </w:rPr>
-        <w:t xml:space="preserve">Users were notably more assertive with app permissions than with cookie banners: 51.3% checked each permission individually, and 92.8% denied or deleted a flashlight app that requested contact access, as shown in Fig. 2. Still, confidence in system controls was limited, only 18.8% felt "very sure" that disabling a permission actually stopped tracking.</w:t>
-      </w:r>
-    </w:p>
-    <w:p>
-      <w:pPr>
-        <w:spacing w:after="0" w:before="0" w:lineRule="auto"/>
-        <w:jc w:val="center"/>
-        <w:rPr>
-          <w:rFonts w:ascii="Times New Roman" w:cs="Times New Roman" w:eastAsia="Times New Roman" w:hAnsi="Times New Roman"/>
-          <w:i w:val="1"/>
-          <w:iCs w:val="1"/>
-          <w:sz w:val="20"/>
-          <w:szCs w:val="20"/>
-        </w:rPr>
-      </w:pPr>
-      <w:r>
-        <w:rPr>
-          <w:rFonts w:ascii="Times New Roman" w:cs="Times New Roman" w:eastAsia="Times New Roman" w:hAnsi="Times New Roman"/>
-          <w:i w:val="1"/>
-          <w:iCs w:val="1"/>
-          <w:sz w:val="20"/>
-          <w:szCs w:val="20"/>
-          <w:rtl w:val="0"/>
-        </w:rPr>
-        <w:t xml:space="preserve">E. Regulatory Attitudes and Statistical Associations</w:t>
-      </w:r>
-    </w:p>
-    <w:p>
-      <w:pPr>
-        <w:spacing w:after="0" w:before="0" w:lineRule="auto"/>
-        <w:ind w:left="0" w:firstLine="288"/>
-        <w:jc w:val="both"/>
-        <w:rPr>
-          <w:rFonts w:ascii="Times New Roman" w:cs="Times New Roman" w:eastAsia="Times New Roman" w:hAnsi="Times New Roman"/>
-          <w:sz w:val="20"/>
-          <w:szCs w:val="20"/>
-        </w:rPr>
-      </w:pPr>
-      <w:sdt>
-        <w:sdtPr>
-          <w:id w:val="-202891417"/>
-          <w:tag w:val="goog_rdk_1"/>
-        </w:sdtPr>
-        <w:sdtContent>
-          <w:r>
-            <w:rPr>
-              <w:rFonts w:ascii="Cardo" w:cs="Cardo" w:eastAsia="Cardo" w:hAnsi="Cardo"/>
-              <w:sz w:val="20"/>
-              <w:szCs w:val="20"/>
-              <w:rtl w:val="0"/>
-            </w:rPr>
-            <w:t xml:space="preserve">Support for structural change was strong: 79.9% favored equal-effort reject/accept design, and 87.6–87.7% supported legal and governmental accountability for undisclosed data sharing (Fig. 2). Spearman rank correlations showed privacy concern was weakly associated with protective cookie behavior (ρ = 0.237, p = .003), dark-pattern exposure showed a weak negative association with quick-accept resistance (ρ = −0.157, p = .052), interface friction showed a similar weak negative association (ρ = −0.201, p = .012), and trust in technology companies was moderately associated with overall satisfaction (ρ = 0.499, p &lt; .001). Tracking knowledge showed no meaningful association with cookie behavior (ρ = −0.012, p = .881), suggesting that awareness alone does not translate into protective action.</w:t>
-          </w:r>
-        </w:sdtContent>
-      </w:sdt>
-    </w:p>
-    <w:p>
-      <w:pPr>
         <w:keepNext w:val="1"/>
         <w:spacing w:after="20" w:lineRule="auto"/>
         <w:jc w:val="center"/>
@@ -4538,13 +4701,13 @@
     <w:sdt>
       <w:sdtPr>
         <w:lock w:val="contentLocked"/>
-        <w:id w:val="229954312"/>
-        <w:tag w:val="goog_rdk_2"/>
+        <w:id w:val="177542575"/>
+        <w:tag w:val="goog_rdk_3"/>
       </w:sdtPr>
       <w:sdtContent>
         <w:tbl>
           <w:tblPr>
-            <w:tblStyle w:val="Table7"/>
+            <w:tblStyle w:val="Table9"/>
             <w:tblW w:w="5250.0" w:type="dxa"/>
             <w:jc w:val="center"/>
             <w:tblBorders>
@@ -6059,17 +6222,29 @@
     </w:sdt>
     <w:p>
       <w:pPr>
-        <w:keepNext w:val="1"/>
-        <w:spacing w:after="20" w:lineRule="auto"/>
+        <w:spacing w:after="0" w:before="0" w:lineRule="auto"/>
         <w:jc w:val="center"/>
         <w:rPr>
           <w:rFonts w:ascii="Times New Roman" w:cs="Times New Roman" w:eastAsia="Times New Roman" w:hAnsi="Times New Roman"/>
+          <w:b w:val="1"/>
+          <w:bCs w:val="1"/>
           <w:i w:val="1"/>
           <w:iCs w:val="1"/>
-          <w:sz w:val="16"/>
-          <w:szCs w:val="16"/>
-        </w:rPr>
-      </w:pPr>
+          <w:sz w:val="20"/>
+          <w:szCs w:val="20"/>
+        </w:rPr>
+      </w:pPr>
+      <w:r>
+        <w:rPr>
+          <w:rFonts w:ascii="Times New Roman" w:cs="Times New Roman" w:eastAsia="Times New Roman" w:hAnsi="Times New Roman"/>
+          <w:i w:val="1"/>
+          <w:iCs w:val="1"/>
+          <w:sz w:val="20"/>
+          <w:szCs w:val="20"/>
+          <w:rtl w:val="0"/>
+        </w:rPr>
+        <w:t xml:space="preserve">D. App Permissions and Protective Behavior</w:t>
+      </w:r>
       <w:r>
         <w:rPr>
           <w:rtl w:val="0"/>
@@ -6089,28 +6264,66 @@
       </w:pPr>
       <w:r>
         <w:rPr>
-          <w:rtl w:val="0"/>
-        </w:rPr>
-      </w:r>
-    </w:p>
-    <w:p>
-      <w:pPr>
-        <w:keepNext w:val="1"/>
-        <w:spacing w:after="20" w:lineRule="auto"/>
+          <w:rFonts w:ascii="Times New Roman" w:cs="Times New Roman" w:eastAsia="Times New Roman" w:hAnsi="Times New Roman"/>
+          <w:sz w:val="20"/>
+          <w:szCs w:val="20"/>
+          <w:rtl w:val="0"/>
+        </w:rPr>
+        <w:t xml:space="preserve">Users were notably more assertive with app permissions than with cookie banners: 51.3% checked each permission individually, and 92.8% denied or deleted a flashlight app that requested contact access, as shown in Fig. 2. Still, confidence in system controls was limited, only 18.8% felt "very sure" that disabling a permission actually stopped tracking.</w:t>
+      </w:r>
+    </w:p>
+    <w:p>
+      <w:pPr>
+        <w:spacing w:after="0" w:before="0" w:lineRule="auto"/>
         <w:jc w:val="center"/>
         <w:rPr>
           <w:rFonts w:ascii="Times New Roman" w:cs="Times New Roman" w:eastAsia="Times New Roman" w:hAnsi="Times New Roman"/>
           <w:i w:val="1"/>
           <w:iCs w:val="1"/>
-          <w:sz w:val="16"/>
-          <w:szCs w:val="16"/>
-        </w:rPr>
-      </w:pPr>
-      <w:r>
-        <w:rPr>
-          <w:rtl w:val="0"/>
-        </w:rPr>
-      </w:r>
+          <w:sz w:val="20"/>
+          <w:szCs w:val="20"/>
+        </w:rPr>
+      </w:pPr>
+      <w:r>
+        <w:rPr>
+          <w:rFonts w:ascii="Times New Roman" w:cs="Times New Roman" w:eastAsia="Times New Roman" w:hAnsi="Times New Roman"/>
+          <w:i w:val="1"/>
+          <w:iCs w:val="1"/>
+          <w:sz w:val="20"/>
+          <w:szCs w:val="20"/>
+          <w:rtl w:val="0"/>
+        </w:rPr>
+        <w:t xml:space="preserve">E. Regulatory Attitudes and Statistical Associations</w:t>
+      </w:r>
+    </w:p>
+    <w:p>
+      <w:pPr>
+        <w:spacing w:after="0" w:before="0" w:lineRule="auto"/>
+        <w:ind w:left="0" w:firstLine="288"/>
+        <w:jc w:val="both"/>
+        <w:rPr>
+          <w:rFonts w:ascii="Times New Roman" w:cs="Times New Roman" w:eastAsia="Times New Roman" w:hAnsi="Times New Roman"/>
+          <w:sz w:val="20"/>
+          <w:szCs w:val="20"/>
+        </w:rPr>
+      </w:pPr>
+      <w:sdt>
+        <w:sdtPr>
+          <w:id w:val="1173595739"/>
+          <w:tag w:val="goog_rdk_4"/>
+        </w:sdtPr>
+        <w:sdtContent>
+          <w:r>
+            <w:rPr>
+              <w:rFonts w:ascii="Cardo" w:cs="Cardo" w:eastAsia="Cardo" w:hAnsi="Cardo"/>
+              <w:sz w:val="20"/>
+              <w:szCs w:val="20"/>
+              <w:rtl w:val="0"/>
+            </w:rPr>
+            <w:t xml:space="preserve">Support for structural change was strong: 79.9% favored equal-effort reject/accept design, and 87.6–87.7% supported legal and governmental accountability for undisclosed data sharing (Fig. 2). Spearman rank correlations showed privacy concern was weakly associated with protective cookie behavior (ρ = 0.237, p = .003), dark-pattern exposure showed a weak negative association with quick-accept resistance (ρ = −0.157, p = .052), interface friction showed a similar weak negative association (ρ = −0.201, p = .012), and trust in technology companies was moderately associated with overall satisfaction (ρ = 0.499, p &lt; .001). Tracking knowledge showed no meaningful association with cookie behavior (ρ = −0.012, p = .881), suggesting that awareness alone does not translate into protective action.</w:t>
+          </w:r>
+        </w:sdtContent>
+      </w:sdt>
     </w:p>
     <w:p>
       <w:pPr>
@@ -6839,14 +7052,6 @@
           <w:rtl w:val="0"/>
         </w:rPr>
         <w:t xml:space="preserve">  With additional time and resources, this study could be extended through controlled A/B experiments comparing symmetric and asymmetric consent banners, along with technical audits of network requests before consent and after rejection. A larger, probability-based sample with broader age, education, and regional representation would improve generalizability beyond the present convenience sample, and the survey instrument itself should be piloted and validated for reliability in future work.</w:t>
-      </w:r>
-      <w:r>
-        <w:br w:type="page"/>
-      </w:r>
-      <w:r>
-        <w:rPr>
-          <w:rtl w:val="0"/>
-        </w:rPr>
       </w:r>
     </w:p>
     <w:p>
@@ -7399,6 +7604,12 @@
     <w:tblPr>
       <w:tblStyleRowBandSize w:val="1"/>
       <w:tblStyleColBandSize w:val="1"/>
+      <w:tblCellMar>
+        <w:top w:w="0.0" w:type="dxa"/>
+        <w:left w:w="115.0" w:type="dxa"/>
+        <w:bottom w:w="0.0" w:type="dxa"/>
+        <w:right w:w="115.0" w:type="dxa"/>
+      </w:tblCellMar>
     </w:tblPr>
   </w:style>
   <w:style w:type="table" w:styleId="Table2">
@@ -7419,12 +7630,6 @@
     <w:tblPr>
       <w:tblStyleRowBandSize w:val="1"/>
       <w:tblStyleColBandSize w:val="1"/>
-      <w:tblCellMar>
-        <w:top w:w="0.0" w:type="dxa"/>
-        <w:left w:w="115.0" w:type="dxa"/>
-        <w:bottom w:w="0.0" w:type="dxa"/>
-        <w:right w:w="115.0" w:type="dxa"/>
-      </w:tblCellMar>
     </w:tblPr>
   </w:style>
   <w:style w:type="table" w:styleId="Table4">
@@ -7467,6 +7672,32 @@
     </w:tblPr>
   </w:style>
   <w:style w:type="table" w:styleId="Table7">
+    <w:basedOn w:val="TableNormal"/>
+    <w:tblPr>
+      <w:tblStyleRowBandSize w:val="1"/>
+      <w:tblStyleColBandSize w:val="1"/>
+      <w:tblCellMar>
+        <w:top w:w="0.0" w:type="dxa"/>
+        <w:left w:w="115.0" w:type="dxa"/>
+        <w:bottom w:w="0.0" w:type="dxa"/>
+        <w:right w:w="115.0" w:type="dxa"/>
+      </w:tblCellMar>
+    </w:tblPr>
+  </w:style>
+  <w:style w:type="table" w:styleId="Table8">
+    <w:basedOn w:val="TableNormal"/>
+    <w:tblPr>
+      <w:tblStyleRowBandSize w:val="1"/>
+      <w:tblStyleColBandSize w:val="1"/>
+      <w:tblCellMar>
+        <w:top w:w="0.0" w:type="dxa"/>
+        <w:left w:w="115.0" w:type="dxa"/>
+        <w:bottom w:w="0.0" w:type="dxa"/>
+        <w:right w:w="115.0" w:type="dxa"/>
+      </w:tblCellMar>
+    </w:tblPr>
+  </w:style>
+  <w:style w:type="table" w:styleId="Table9">
     <w:basedOn w:val="TableNormal"/>
     <w:tblPr>
       <w:tblStyleRowBandSize w:val="1"/>
@@ -7798,7 +8029,7 @@
 
 <file path=customXML/item1.xml><?xml version="1.0" encoding="utf-8"?>
 <go:gDocsCustomXmlDataStorage xmlns:go="http://customooxmlschemas.google.com/" xmlns:r="http://schemas.openxmlformats.org/officeDocument/2006/relationships" uri="GoogleDocsCustomDataVersion2">
-  <go:docsCustomData xmlns:go="http://customooxmlschemas.google.com/" roundtripDataSignature="AMtx7mjR1beYwt6mtd2bMohUF+GT8pBpLA==">CgMxLjAaHwoBMBIaChgICVIUChJ0YWJsZS5iYzRjM2g2c2dodXoaIwoBMRIeChwIB0IYCg9UaW1lcyBOZXcgUm9tYW4SBUNhcmRvGh8KATISGgoYCAlSFAoSdGFibGUuYmRoZnIzMmo3OWQ3Mg5oLnU3NjAwZWE5bngwdDIOaC5qcmFtd2IxaWZ5ajAyDmguc2lidWpmYmhwbHd4Mg5pZC51ZnF1dTc2NjJybDIPaWQuYjQ2ZXoyMjBsYzd3Mg9pZC51bGxtc3J0cG5uc2kyD2lkLjdocDF4eXZqcmE3eTIPaWQucWFsOW1vYzV1b2JvMg9pZC50bXRtemt1cXMweTIyD2lkLjExMmVzdWF4eWQ1dDIPaWQuNXUyZDBqaG4zeWY3Mg9pZC5hejd1cHpkdWh0MmY4AHIhMTdMa1FjNV93RC03N2RKYlVqaXRLcGJLUlZQNTJmRWVL</go:docsCustomData>
+  <go:docsCustomData xmlns:go="http://customooxmlschemas.google.com/" roundtripDataSignature="AMtx7mjWsT/Kx2KtQK9UOD/kmMqhqE9O1g==">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</go:docsCustomData>
 </go:gDocsCustomXmlDataStorage>
 </file>
 

</xml_diff>